<commit_message>
Fix documentation errors in foundation model doc (v0.1.1)
- Correct parameter count: 50M → 24.7M (actual implementation)
- §4.3: Add Phase 1 implementation note — running inverse-variance
  regularizer, not the full entropy+smoothness formulation in spec
- §4.5: Add explicit Phase 1 lr=1e-3 and Phase 2 recommendation 3e-4
- §4.5: Update gradient checkpointing status (disabled at step 28k)
- §6.1: Fill partial empirical results at step 28,000 (R@1=1.0%, loss~4.3)
- Add v0.1.1 version history entry

Co-Authored-By: Claude Sonnet 4.6 <noreply@anthropic.com>
</commit_message>
<xml_diff>
--- a/project_plan/keural_foundation_model_doc.docx
+++ b/project_plan/keural_foundation_model_doc.docx
@@ -48,6 +48,11 @@
           <w:szCs w:val="36"/>
         </w:rPr>
         <w:t>Version history:</w:t>
+      </w:r>
+    </w:p>
+    <w:p>
+      <w:r>
+        <w:t xml:space="preserve">v0.1.1 — 2026-05-11: Corrected parameter count (50M → 24.7M actual); updated §4.3 with Phase 1 saliency implementation note (inverse-variance, not entropy); updated §4.5 with explicit Phase 1 LR (1e-3) and Phase 2 recommendation (3e-4); updated §6.1 with partial empirical results at step 28,000; updated gradient checkpointing status.</w:t>
       </w:r>
     </w:p>
     <w:p>
@@ -5076,6 +5081,16 @@
       </w:r>
     </w:p>
     <w:p>
+      <w:r>
+        <w:rPr>
+          <w:b/>
+          <w:color w:val="B8860B"/>
+          <w:i/>
+        </w:rPr>
+        <w:t xml:space="preserve">Implementation note (Phase 1 / V0.1): The running implementation uses a simplified inverse-variance regularizer instead of the full entropy + smoothness formulation above. Specifically: L_sal = mean_b(1 / (Var_b(S) + ε)), which penalises flat (uniform) saliency but does NOT include the H_min/H_max entropy clamps or the spatial gradient smoothness term ‖∇S‖². Effect: the model can satisfy this loss with spatially incoherent (salt-and-pepper) saliency patterns — consistent with the near-random saliency maps observed at step 28,000. The full formulation (Eq. 4.6) is the Phase 2 target. This is a known limitation of Phase 1.</w:t>
+      </w:r>
+    </w:p>
+    <w:p>
       <w:pPr>
         <w:pStyle w:val="Heading2"/>
         <w:jc w:val="both"/>
@@ -5393,23 +5408,19 @@
         <w:jc w:val="both"/>
       </w:pPr>
       <w:r>
-        <w:t xml:space="preserve">We use </w:t>
-      </w:r>
-      <w:proofErr w:type="spellStart"/>
-      <w:r>
-        <w:t>AdamW</w:t>
-      </w:r>
-      <w:proofErr w:type="spellEnd"/>
-      <w:r>
-        <w:t xml:space="preserve"> (Loshchilov &amp; Hutter 2019) with β₁ = 0.9, β₂ = 0.95, weight decay 0.05 (POC) or 0.1 (Phase 2/3). Learning rate follows a cosine schedule with linear warmup (Loshchilov &amp; Hutter 2017). Effective batch size is achieved through gradient accumulation; gradient clipping at norm 1.0 is applied after accumulation.</w:t>
-      </w:r>
-    </w:p>
-    <w:p>
-      <w:pPr>
-        <w:jc w:val="both"/>
-      </w:pPr>
-      <w:r>
-        <w:t>Mixed precision (bf16) is used throughout. Gradient checkpointing is enabled by default to fit larger batches in VRAM; the recompute cost is ~30% of forward time, well worth the activation memory savings. The text encoder body is frozen; only its output projection trains, dramatically reducing optimizer state.</w:t>
+        <w:t>We use AdamW (Loshchilov &amp; Hutter 2019) with β₁ = 0.9, β₂ = 0.95, weight decay 0.05 (POC) or 0.1 (Phase 2/3). Learning rate follows a cosine schedule with linear warmup (Loshchilov &amp; Hutter 2017). Phase 1 (POC) uses lr = 1e-3 with 2,000 warmup steps; Phase 2+ should use lr = 3e-4 for better final representation quality. Effective batch size is achieved through gradient accumulation; gradient clipping at norm 1.0 is applied after accumulation.</w:t>
+      </w:r>
+      <w:proofErr w:type="spellStart"/>
+      <w:r/>
+      <w:proofErr w:type="spellEnd"/>
+      <w:r/>
+    </w:p>
+    <w:p>
+      <w:pPr>
+        <w:jc w:val="both"/>
+      </w:pPr>
+      <w:r>
+        <w:t>Mixed precision (bf16) is used throughout. Gradient checkpointing was enabled initially (saving ~14 GB VRAM at ~30% compute cost) and was disabled at step 28,000 to improve throughput once VRAM headroom was confirmed (25.8 GB / 32 GB with checkpointing off). Disable for speed if VRAM allows. The text encoder body is frozen; only its output projection trains, dramatically reducing optimizer state.</w:t>
       </w:r>
     </w:p>
     <w:p>
@@ -6117,7 +6128,7 @@
         <w:jc w:val="both"/>
       </w:pPr>
       <w:r>
-        <w:t>Training data: filtered CC3M + CC12M (~8–10M pairs after URL rot). Model: 50M parameters. Hardware: 1× RTX 5090. Steps: 75,000. Effective batch size: 1024. Frozen text encoder: MiniLM-L6-v2.</w:t>
+        <w:t>Training data: filtered CC3M + CC12M (~8–10M pairs after URL rot). Model: 24.7M (actual; spec originally estimated ~50M) parameters. Hardware: 1× RTX 5090. Steps: 75,000. Effective batch size: 1024. Frozen text encoder: MiniLM-L6-v2.</w:t>
       </w:r>
     </w:p>
     <w:p>
@@ -7610,7 +7621,7 @@
         <w:jc w:val="both"/>
       </w:pPr>
       <w:r>
-        <w:t xml:space="preserve">Model: Keural-Tiny, ~50M parameters, </w:t>
+        <w:t xml:space="preserve">Model: Keural-Tiny, 24.7M (actual) parameters, </w:t>
       </w:r>
       <w:proofErr w:type="spellStart"/>
       <w:r>

</xml_diff>